<commit_message>
ISO W10 sapuan HR: HR-ORG-01, HR-JA-01
Lolos gerbang mesin W10 dan pemeriksa bahasa buta; satu kata sambung di HR-ORG-01
dikembalikan ke arti asli (temuan nonblocking).

Co-Authored-By: Claude Opus 5.5 <noreply@anthropic.com>
Claude-Session: https://claude.ai/code/session_01BhkCQM7h3krZb9kjY2Nate
</commit_message>
<xml_diff>
--- a/out/01_Struktur_Jobdesc/SNX-HR-ORG-01 Struktur Organisasi SINUX (Rev00 DRAFT).docx
+++ b/out/01_Struktur_Jobdesc/SNX-HR-ORG-01 Struktur Organisasi SINUX (Rev00 DRAFT).docx
@@ -217,6 +217,7 @@
     <w:p>
       <w:pPr>
         <w:pStyle w:val="Heading1"/>
+        <w:keepNext/>
         <w:widowControl w:val="0"/>
         <w:spacing w:line="240" w:lineRule="auto"/>
         <w:ind w:right="407" w:firstLine="0"/>
@@ -511,6 +512,10 @@
         <w:gridCol w:w="5850"/>
       </w:tblGrid>
       <w:tr>
+        <w:trPr>
+          <w:cantSplit/>
+          <w:tblHeader/>
+        </w:trPr>
         <w:tc>
           <w:tcPr>
             <w:tcW w:w="3150" w:type="dxa"/>
@@ -523,6 +528,7 @@
           </w:tcPr>
           <w:p>
             <w:pPr>
+              <w:keepNext/>
               <w:widowControl w:val="0"/>
               <w:pBdr>
                 <w:top w:val="nil"/>
@@ -563,6 +569,7 @@
           </w:tcPr>
           <w:p>
             <w:pPr>
+              <w:keepNext/>
               <w:widowControl w:val="0"/>
               <w:pBdr>
                 <w:top w:val="nil"/>
@@ -593,6 +600,9 @@
         </w:tc>
       </w:tr>
       <w:tr>
+        <w:trPr>
+          <w:cantSplit/>
+        </w:trPr>
         <w:tc>
           <w:tcPr>
             <w:tcW w:w="3150" w:type="dxa"/>
@@ -646,6 +656,9 @@
         </w:tc>
       </w:tr>
       <w:tr>
+        <w:trPr>
+          <w:cantSplit/>
+        </w:trPr>
         <w:tc>
           <w:tcPr>
             <w:tcW w:w="3150" w:type="dxa"/>
@@ -699,6 +712,9 @@
         </w:tc>
       </w:tr>
       <w:tr>
+        <w:trPr>
+          <w:cantSplit/>
+        </w:trPr>
         <w:tc>
           <w:tcPr>
             <w:tcW w:w="3150" w:type="dxa"/>
@@ -750,6 +766,9 @@
         </w:tc>
       </w:tr>
       <w:tr>
+        <w:trPr>
+          <w:cantSplit/>
+        </w:trPr>
         <w:tc>
           <w:tcPr>
             <w:tcW w:w="3150" w:type="dxa"/>
@@ -810,6 +829,9 @@
         </w:tc>
       </w:tr>
       <w:tr>
+        <w:trPr>
+          <w:cantSplit/>
+        </w:trPr>
         <w:tc>
           <w:tcPr>
             <w:tcW w:w="3150" w:type="dxa"/>
@@ -861,6 +883,9 @@
         </w:tc>
       </w:tr>
       <w:tr>
+        <w:trPr>
+          <w:cantSplit/>
+        </w:trPr>
         <w:tc>
           <w:tcPr>
             <w:tcW w:w="3150" w:type="dxa"/>
@@ -914,6 +939,9 @@
         </w:tc>
       </w:tr>
       <w:tr>
+        <w:trPr>
+          <w:cantSplit/>
+        </w:trPr>
         <w:tc>
           <w:tcPr>
             <w:tcW w:w="3150" w:type="dxa"/>
@@ -967,6 +995,9 @@
         </w:tc>
       </w:tr>
       <w:tr>
+        <w:trPr>
+          <w:cantSplit/>
+        </w:trPr>
         <w:tc>
           <w:tcPr>
             <w:tcW w:w="3150" w:type="dxa"/>
@@ -1020,6 +1051,9 @@
         </w:tc>
       </w:tr>
       <w:tr>
+        <w:trPr>
+          <w:cantSplit/>
+        </w:trPr>
         <w:tc>
           <w:tcPr>
             <w:tcW w:w="3150" w:type="dxa"/>
@@ -1073,6 +1107,9 @@
         </w:tc>
       </w:tr>
       <w:tr>
+        <w:trPr>
+          <w:cantSplit/>
+        </w:trPr>
         <w:tc>
           <w:tcPr>
             <w:tcW w:w="3150" w:type="dxa"/>
@@ -1126,6 +1163,9 @@
         </w:tc>
       </w:tr>
       <w:tr>
+        <w:trPr>
+          <w:cantSplit/>
+        </w:trPr>
         <w:tc>
           <w:tcPr>
             <w:tcW w:w="3150" w:type="dxa"/>
@@ -1207,6 +1247,7 @@
     <w:p>
       <w:pPr>
         <w:pStyle w:val="Heading1"/>
+        <w:keepNext/>
         <w:widowControl w:val="0"/>
         <w:spacing w:before="816" w:line="240" w:lineRule="auto"/>
         <w:ind w:right="407"/>
@@ -1243,6 +1284,10 @@
         <w:gridCol w:w="3010"/>
       </w:tblGrid>
       <w:tr>
+        <w:trPr>
+          <w:cantSplit/>
+          <w:tblHeader/>
+        </w:trPr>
         <w:tc>
           <w:tcPr>
             <w:tcW w:w="3009" w:type="dxa"/>
@@ -1255,6 +1300,7 @@
           </w:tcPr>
           <w:p>
             <w:pPr>
+              <w:keepNext/>
               <w:widowControl w:val="0"/>
               <w:spacing w:line="240" w:lineRule="auto"/>
               <w:jc w:val="center"/>
@@ -1288,6 +1334,7 @@
           </w:tcPr>
           <w:p>
             <w:pPr>
+              <w:keepNext/>
               <w:widowControl w:val="0"/>
               <w:spacing w:line="240" w:lineRule="auto"/>
               <w:jc w:val="center"/>
@@ -1321,6 +1368,7 @@
           </w:tcPr>
           <w:p>
             <w:pPr>
+              <w:keepNext/>
               <w:widowControl w:val="0"/>
               <w:spacing w:line="240" w:lineRule="auto"/>
               <w:jc w:val="center"/>
@@ -1344,6 +1392,9 @@
         </w:tc>
       </w:tr>
       <w:tr>
+        <w:trPr>
+          <w:cantSplit/>
+        </w:trPr>
         <w:tc>
           <w:tcPr>
             <w:tcW w:w="3009" w:type="dxa"/>
@@ -1392,6 +1443,9 @@
         </w:tc>
       </w:tr>
       <w:tr>
+        <w:trPr>
+          <w:cantSplit/>
+        </w:trPr>
         <w:tc>
           <w:tcPr>
             <w:tcW w:w="3009" w:type="dxa"/>
@@ -1463,6 +1517,9 @@
         </w:tc>
       </w:tr>
       <w:tr>
+        <w:trPr>
+          <w:cantSplit/>
+        </w:trPr>
         <w:tc>
           <w:tcPr>
             <w:tcW w:w="3009" w:type="dxa"/>
@@ -1537,6 +1594,7 @@
     <w:p>
       <w:pPr>
         <w:pStyle w:val="Heading1"/>
+        <w:keepNext/>
         <w:widowControl w:val="0"/>
         <w:spacing w:before="816" w:line="240" w:lineRule="auto"/>
         <w:ind w:right="407"/>
@@ -1578,6 +1636,10 @@
         <w:gridCol w:w="2235"/>
       </w:tblGrid>
       <w:tr>
+        <w:trPr>
+          <w:cantSplit/>
+          <w:tblHeader/>
+        </w:trPr>
         <w:tc>
           <w:tcPr>
             <w:tcW w:w="810" w:type="dxa"/>
@@ -1590,6 +1652,7 @@
           </w:tcPr>
           <w:p>
             <w:pPr>
+              <w:keepNext/>
               <w:widowControl w:val="0"/>
               <w:pBdr>
                 <w:top w:val="nil"/>
@@ -1630,6 +1693,7 @@
           </w:tcPr>
           <w:p>
             <w:pPr>
+              <w:keepNext/>
               <w:widowControl w:val="0"/>
               <w:spacing w:line="240" w:lineRule="auto"/>
               <w:jc w:val="center"/>
@@ -1663,6 +1727,7 @@
           </w:tcPr>
           <w:p>
             <w:pPr>
+              <w:keepNext/>
               <w:widowControl w:val="0"/>
               <w:pBdr>
                 <w:top w:val="nil"/>
@@ -1703,6 +1768,7 @@
           </w:tcPr>
           <w:p>
             <w:pPr>
+              <w:keepNext/>
               <w:widowControl w:val="0"/>
               <w:pBdr>
                 <w:top w:val="nil"/>
@@ -1733,6 +1799,9 @@
         </w:tc>
       </w:tr>
       <w:tr>
+        <w:trPr>
+          <w:cantSplit/>
+        </w:trPr>
         <w:tc>
           <w:tcPr>
             <w:tcW w:w="810" w:type="dxa"/>
@@ -1835,6 +1904,9 @@
         </w:tc>
       </w:tr>
       <w:tr>
+        <w:trPr>
+          <w:cantSplit/>
+        </w:trPr>
         <w:tc>
           <w:tcPr>
             <w:tcW w:w="810" w:type="dxa"/>
@@ -1937,6 +2009,9 @@
         </w:tc>
       </w:tr>
       <w:tr>
+        <w:trPr>
+          <w:cantSplit/>
+        </w:trPr>
         <w:tc>
           <w:tcPr>
             <w:tcW w:w="810" w:type="dxa"/>
@@ -2379,7 +2454,7 @@
           <w:sz w:val="24"/>
           <w:szCs w:val="24"/>
         </w:rPr>
-        <w:t xml:space="preserve">Hasil yang dijaga adalah satu susunan yang sama bagi karyawan dan auditor, sehingga peran, tanggung jawab, dan wewenang yang diminta ISO 9001:2015 dan ISO/IEC 27001:2022 dapat ditunjukkan dari satu dokumen.</w:t>
+        <w:t xml:space="preserve">Karyawan dan auditor memakai susunan yang sama, sehingga peran, tanggung jawab, dan wewenang yang diminta ISO 9001:2015 dan ISO/IEC 27001:2022 dapat ditunjukkan dari satu dokumen.</w:t>
       </w:r>
     </w:p>
     <w:p>
@@ -2421,6 +2496,7 @@
     </w:p>
     <w:p>
       <w:pPr>
+        <w:keepNext/>
         <w:pBdr>
           <w:top w:val="nil"/>
           <w:left w:val="nil"/>
@@ -2458,6 +2534,8 @@
       </w:tblGrid>
       <w:tr>
         <w:trPr>
+          <w:cantSplit/>
+          <w:tblHeader/>
           <w:jc w:val="center"/>
         </w:trPr>
         <w:tc>
@@ -2473,6 +2551,7 @@
           </w:tcPr>
           <w:p>
             <w:pPr>
+              <w:keepNext/>
               <w:jc w:val="center"/>
               <w:rPr>
                 <w:sz w:val="24"/>
@@ -2503,6 +2582,7 @@
           </w:tcPr>
           <w:p>
             <w:pPr>
+              <w:keepNext/>
               <w:jc w:val="center"/>
               <w:rPr>
                 <w:sz w:val="24"/>
@@ -2523,6 +2603,7 @@
       </w:tr>
       <w:tr>
         <w:trPr>
+          <w:cantSplit/>
           <w:jc w:val="center"/>
         </w:trPr>
         <w:tc>
@@ -2584,6 +2665,7 @@
       </w:tr>
       <w:tr>
         <w:trPr>
+          <w:cantSplit/>
           <w:jc w:val="center"/>
         </w:trPr>
         <w:tc>
@@ -2645,6 +2727,7 @@
       </w:tr>
       <w:tr>
         <w:trPr>
+          <w:cantSplit/>
           <w:jc w:val="center"/>
         </w:trPr>
         <w:tc>
@@ -2706,6 +2789,7 @@
       </w:tr>
       <w:tr>
         <w:trPr>
+          <w:cantSplit/>
           <w:jc w:val="center"/>
         </w:trPr>
         <w:tc>
@@ -2767,6 +2851,7 @@
       </w:tr>
       <w:tr>
         <w:trPr>
+          <w:cantSplit/>
           <w:jc w:val="center"/>
         </w:trPr>
         <w:tc>
@@ -2854,6 +2939,7 @@
     <w:p>
       <w:pPr>
         <w:pStyle w:val="Heading1"/>
+        <w:keepNext/>
         <w:numPr>
           <w:ilvl w:val="0"/>
           <w:numId w:val="7"/>
@@ -2879,6 +2965,8 @@
       </w:tblGrid>
       <w:tr>
         <w:trPr>
+          <w:cantSplit/>
+          <w:tblHeader/>
           <w:jc w:val="center"/>
         </w:trPr>
         <w:tc>
@@ -2894,6 +2982,7 @@
           </w:tcPr>
           <w:p>
             <w:pPr>
+              <w:keepNext/>
               <w:jc w:val="center"/>
               <w:rPr>
                 <w:sz w:val="24"/>
@@ -2924,6 +3013,7 @@
           </w:tcPr>
           <w:p>
             <w:pPr>
+              <w:keepNext/>
               <w:jc w:val="center"/>
               <w:rPr>
                 <w:sz w:val="24"/>
@@ -2944,6 +3034,7 @@
       </w:tr>
       <w:tr>
         <w:trPr>
+          <w:cantSplit/>
           <w:jc w:val="center"/>
         </w:trPr>
         <w:tc>
@@ -3005,6 +3096,7 @@
       </w:tr>
       <w:tr>
         <w:trPr>
+          <w:cantSplit/>
           <w:jc w:val="center"/>
         </w:trPr>
         <w:tc>
@@ -3066,6 +3158,7 @@
       </w:tr>
       <w:tr>
         <w:trPr>
+          <w:cantSplit/>
           <w:jc w:val="center"/>
         </w:trPr>
         <w:tc>
@@ -3120,13 +3213,14 @@
                 <w:sz w:val="24"/>
                 <w:szCs w:val="24"/>
               </w:rPr>
-              <w:t>Jabatan yang menjadi tujuan laporan langsung dari sebuah jabatan.</w:t>
+              <w:t>Jabatan tempat sebuah jabatan melapor secara langsung.</w:t>
             </w:r>
           </w:p>
         </w:tc>
       </w:tr>
       <w:tr>
         <w:trPr>
+          <w:cantSplit/>
           <w:jc w:val="center"/>
         </w:trPr>
         <w:tc>
@@ -3188,6 +3282,7 @@
       </w:tr>
       <w:tr>
         <w:trPr>
+          <w:cantSplit/>
           <w:jc w:val="center"/>
         </w:trPr>
         <w:tc>
@@ -3242,13 +3337,14 @@
                 <w:sz w:val="24"/>
                 <w:szCs w:val="24"/>
               </w:rPr>
-              <w:t>Label untuk garis lapor atau penamaan yang belum pasti. Tiap butir dijelaskan pada bagian Butir Menunggu Konfirmasi.</w:t>
+              <w:t>Label untuk garis lapor atau penamaan yang belum pasti, diuraikan per butir pada bagian Butir Menunggu Konfirmasi.</w:t>
             </w:r>
           </w:p>
         </w:tc>
       </w:tr>
       <w:tr>
         <w:trPr>
+          <w:cantSplit/>
           <w:jc w:val="center"/>
         </w:trPr>
         <w:tc>
@@ -3303,13 +3399,14 @@
                 <w:sz w:val="24"/>
                 <w:szCs w:val="24"/>
               </w:rPr>
-              <w:t>Tanggung jawab dalam sistem manajemen yang disebut dokumen SOP, dipegang oleh pemegang satu jabatan atau lebih.</w:t>
+              <w:t>Tanggung jawab dalam sistem manajemen yang disebut di dokumen SOP dan dipegang oleh satu jabatan atau lebih.</w:t>
             </w:r>
           </w:p>
         </w:tc>
       </w:tr>
       <w:tr>
         <w:trPr>
+          <w:cantSplit/>
           <w:jc w:val="center"/>
         </w:trPr>
         <w:tc>
@@ -3371,6 +3468,7 @@
       </w:tr>
       <w:tr>
         <w:trPr>
+          <w:cantSplit/>
           <w:jc w:val="center"/>
         </w:trPr>
         <w:tc>
@@ -3432,6 +3530,7 @@
       </w:tr>
       <w:tr>
         <w:trPr>
+          <w:cantSplit/>
           <w:jc w:val="center"/>
         </w:trPr>
         <w:tc>
@@ -3493,6 +3592,7 @@
       </w:tr>
       <w:tr>
         <w:trPr>
+          <w:cantSplit/>
           <w:jc w:val="center"/>
         </w:trPr>
         <w:tc>
@@ -3547,13 +3647,14 @@
                 <w:sz w:val="24"/>
                 <w:szCs w:val="24"/>
               </w:rPr>
-              <w:t>Sub divisi Divisi Operation yang memantau dashboard layanan dan menangani tiket.</w:t>
+              <w:t>Sub divisi Divisi Operation yang memantau dashboard layanan dan menangani ticket.</w:t>
             </w:r>
           </w:p>
         </w:tc>
       </w:tr>
       <w:tr>
         <w:trPr>
+          <w:cantSplit/>
           <w:jc w:val="center"/>
         </w:trPr>
         <w:tc>
@@ -3615,6 +3716,7 @@
       </w:tr>
       <w:tr>
         <w:trPr>
+          <w:cantSplit/>
           <w:jc w:val="center"/>
         </w:trPr>
         <w:tc>
@@ -3676,6 +3778,7 @@
       </w:tr>
       <w:tr>
         <w:trPr>
+          <w:cantSplit/>
           <w:jc w:val="center"/>
         </w:trPr>
         <w:tc>
@@ -3737,6 +3840,7 @@
       </w:tr>
       <w:tr>
         <w:trPr>
+          <w:cantSplit/>
           <w:jc w:val="center"/>
         </w:trPr>
         <w:tc>
@@ -3798,6 +3902,7 @@
       </w:tr>
       <w:tr>
         <w:trPr>
+          <w:cantSplit/>
           <w:jc w:val="center"/>
         </w:trPr>
         <w:tc>
@@ -3940,7 +4045,7 @@
           <w:sz w:val="24"/>
           <w:szCs w:val="24"/>
         </w:rPr>
-        <w:t xml:space="preserve">Job Analysis menyatakan bahwa hubungan atasan-bawahan yang bertanda usulan atau konfirmasi tidak boleh diperlakukan sebagai garis lapor resmi sampai disahkan. Karena itu semua garis lapor di dokumen ini baru resmi sesudah dokumen ini disahkan, dan garis yang belum diberi satu atasan oleh Job Analysis (SNX-HR-JA-01) diberi label menunggu konfirmasi.</w:t>
+        <w:t xml:space="preserve">Menurut Job Analysis, hubungan atasan-bawahan yang bertanda usulan atau konfirmasi belum menjadi garis lapor resmi sampai disahkan. Karena itu, semua garis lapor di dokumen ini baru resmi setelah dokumen ini disahkan. Garis yang belum diberi satu atasan oleh Job Analysis (SNX-HR-JA-01) diberi label menunggu konfirmasi.</w:t>
       </w:r>
     </w:p>
     <w:p>
@@ -3964,7 +4069,7 @@
           <w:sz w:val="24"/>
           <w:szCs w:val="24"/>
         </w:rPr>
-        <w:t xml:space="preserve">Setiap butir menunggu konfirmasi diberi nomor K pada bagian Butir Menunggu Konfirmasi. Bagan dan tabel merujuk nomor itu dan tidak mengulang uraiannya.</w:t>
+        <w:t xml:space="preserve">Setiap butir menunggu konfirmasi diberi nomor K pada bagian Butir Menunggu Konfirmasi. Bagan dan tabel cukup mencantumkan nomor itu tanpa mengulang uraiannya.</w:t>
       </w:r>
     </w:p>
     <w:p>
@@ -3988,7 +4093,7 @@
           <w:sz w:val="24"/>
           <w:szCs w:val="24"/>
         </w:rPr>
-        <w:t xml:space="preserve">Nama jabatan ditulis dalam satu bentuk di seluruh dokumen. Bila sumber memakai sebutan lain, perbedaannya tercatat sebagai butir K.</w:t>
+        <w:t xml:space="preserve">Nama jabatan ditulis dalam satu bentuk di seluruh dokumen. Jika sumber memakai sebutan lain, perbedaannya dicatat sebagai butir K.</w:t>
       </w:r>
     </w:p>
     <w:p>
@@ -4025,7 +4130,7 @@
           <w:sz w:val="24"/>
           <w:szCs w:val="24"/>
         </w:rPr>
-        <w:t xml:space="preserve">Gambar 1 dan Gambar 2 menggambarkan 15 jabatan di Job Analysis. Garis tanpa label menunjukkan atasan langsung yang tertulis di Job Analysis atau sudah diputus (K-01). Garis berlabel menunggu konfirmasi merujuk nomor butir K.</w:t>
+        <w:t xml:space="preserve">Gambar 1 dan Gambar 2 memuat 15 jabatan di Job Analysis. Garis tanpa label menunjukkan atasan langsung yang tertulis di Job Analysis atau sudah diputus (K-01). Garis berlabel menunggu konfirmasi diberi nomor butir K.</w:t>
       </w:r>
     </w:p>
     <w:p>
@@ -4207,6 +4312,7 @@
     </w:p>
     <w:p>
       <w:pPr>
+        <w:keepNext/>
         <w:pBdr>
           <w:top w:val="nil"/>
           <w:left w:val="nil"/>
@@ -4226,7 +4332,7 @@
           <w:sz w:val="24"/>
           <w:szCs w:val="24"/>
         </w:rPr>
-        <w:t xml:space="preserve">Kolom Melapor ke memuat atasan langsung menurut Job Analysis dan garis yang sudah diputus pada K-01.</w:t>
+        <w:t xml:space="preserve">Kolom Melapor ke berisi atasan langsung menurut Job Analysis, ditambah garis yang sudah diputus pada K-01.</w:t>
       </w:r>
     </w:p>
     <w:tbl>
@@ -4247,6 +4353,8 @@
       </w:tblGrid>
       <w:tr>
         <w:trPr>
+          <w:cantSplit/>
+          <w:tblHeader/>
           <w:jc w:val="center"/>
         </w:trPr>
         <w:tc>
@@ -4262,6 +4370,7 @@
           </w:tcPr>
           <w:p>
             <w:pPr>
+              <w:keepNext/>
               <w:jc w:val="center"/>
               <w:rPr>
                 <w:sz w:val="24"/>
@@ -4292,6 +4401,7 @@
           </w:tcPr>
           <w:p>
             <w:pPr>
+              <w:keepNext/>
               <w:jc w:val="center"/>
               <w:rPr>
                 <w:sz w:val="24"/>
@@ -4322,6 +4432,7 @@
           </w:tcPr>
           <w:p>
             <w:pPr>
+              <w:keepNext/>
               <w:jc w:val="center"/>
               <w:rPr>
                 <w:sz w:val="24"/>
@@ -4352,6 +4463,7 @@
           </w:tcPr>
           <w:p>
             <w:pPr>
+              <w:keepNext/>
               <w:jc w:val="center"/>
               <w:rPr>
                 <w:sz w:val="24"/>
@@ -4382,6 +4494,7 @@
           </w:tcPr>
           <w:p>
             <w:pPr>
+              <w:keepNext/>
               <w:jc w:val="center"/>
               <w:rPr>
                 <w:sz w:val="24"/>
@@ -4402,6 +4515,7 @@
       </w:tr>
       <w:tr>
         <w:trPr>
+          <w:cantSplit/>
           <w:jc w:val="center"/>
         </w:trPr>
         <w:tc>
@@ -4473,7 +4587,7 @@
           </w:tcPr>
           <w:p>
             <w:pPr>
-              <w:jc w:val="both"/>
+              <w:jc w:val="left"/>
               <w:rPr>
                 <w:sz w:val="24"/>
                 <w:szCs w:val="24"/>
@@ -4502,7 +4616,7 @@
           </w:tcPr>
           <w:p>
             <w:pPr>
-              <w:jc w:val="both"/>
+              <w:jc w:val="left"/>
               <w:rPr>
                 <w:sz w:val="24"/>
                 <w:szCs w:val="24"/>
@@ -4531,7 +4645,7 @@
           </w:tcPr>
           <w:p>
             <w:pPr>
-              <w:jc w:val="both"/>
+              <w:jc w:val="left"/>
               <w:rPr>
                 <w:sz w:val="24"/>
                 <w:szCs w:val="24"/>
@@ -4550,6 +4664,7 @@
       </w:tr>
       <w:tr>
         <w:trPr>
+          <w:cantSplit/>
           <w:jc w:val="center"/>
         </w:trPr>
         <w:tc>
@@ -4621,7 +4736,7 @@
           </w:tcPr>
           <w:p>
             <w:pPr>
-              <w:jc w:val="both"/>
+              <w:jc w:val="left"/>
               <w:rPr>
                 <w:sz w:val="24"/>
                 <w:szCs w:val="24"/>
@@ -4650,7 +4765,7 @@
           </w:tcPr>
           <w:p>
             <w:pPr>
-              <w:jc w:val="both"/>
+              <w:jc w:val="left"/>
               <w:rPr>
                 <w:sz w:val="24"/>
                 <w:szCs w:val="24"/>
@@ -4679,7 +4794,7 @@
           </w:tcPr>
           <w:p>
             <w:pPr>
-              <w:jc w:val="both"/>
+              <w:jc w:val="left"/>
               <w:rPr>
                 <w:sz w:val="24"/>
                 <w:szCs w:val="24"/>
@@ -4698,6 +4813,7 @@
       </w:tr>
       <w:tr>
         <w:trPr>
+          <w:cantSplit/>
           <w:jc w:val="center"/>
         </w:trPr>
         <w:tc>
@@ -4769,7 +4885,7 @@
           </w:tcPr>
           <w:p>
             <w:pPr>
-              <w:jc w:val="both"/>
+              <w:jc w:val="left"/>
               <w:rPr>
                 <w:sz w:val="24"/>
                 <w:szCs w:val="24"/>
@@ -4798,7 +4914,7 @@
           </w:tcPr>
           <w:p>
             <w:pPr>
-              <w:jc w:val="both"/>
+              <w:jc w:val="left"/>
               <w:rPr>
                 <w:sz w:val="24"/>
                 <w:szCs w:val="24"/>
@@ -4827,7 +4943,7 @@
           </w:tcPr>
           <w:p>
             <w:pPr>
-              <w:jc w:val="both"/>
+              <w:jc w:val="left"/>
               <w:rPr>
                 <w:sz w:val="24"/>
                 <w:szCs w:val="24"/>
@@ -4846,6 +4962,7 @@
       </w:tr>
       <w:tr>
         <w:trPr>
+          <w:cantSplit/>
           <w:jc w:val="center"/>
         </w:trPr>
         <w:tc>
@@ -4917,7 +5034,7 @@
           </w:tcPr>
           <w:p>
             <w:pPr>
-              <w:jc w:val="both"/>
+              <w:jc w:val="left"/>
               <w:rPr>
                 <w:sz w:val="24"/>
                 <w:szCs w:val="24"/>
@@ -4946,7 +5063,7 @@
           </w:tcPr>
           <w:p>
             <w:pPr>
-              <w:jc w:val="both"/>
+              <w:jc w:val="left"/>
               <w:rPr>
                 <w:sz w:val="24"/>
                 <w:szCs w:val="24"/>
@@ -4975,7 +5092,7 @@
           </w:tcPr>
           <w:p>
             <w:pPr>
-              <w:jc w:val="both"/>
+              <w:jc w:val="left"/>
               <w:rPr>
                 <w:sz w:val="24"/>
                 <w:szCs w:val="24"/>
@@ -4994,6 +5111,7 @@
       </w:tr>
       <w:tr>
         <w:trPr>
+          <w:cantSplit/>
           <w:jc w:val="center"/>
         </w:trPr>
         <w:tc>
@@ -5065,7 +5183,7 @@
           </w:tcPr>
           <w:p>
             <w:pPr>
-              <w:jc w:val="both"/>
+              <w:jc w:val="left"/>
               <w:rPr>
                 <w:sz w:val="24"/>
                 <w:szCs w:val="24"/>
@@ -5094,7 +5212,7 @@
           </w:tcPr>
           <w:p>
             <w:pPr>
-              <w:jc w:val="both"/>
+              <w:jc w:val="left"/>
               <w:rPr>
                 <w:sz w:val="24"/>
                 <w:szCs w:val="24"/>
@@ -5123,7 +5241,7 @@
           </w:tcPr>
           <w:p>
             <w:pPr>
-              <w:jc w:val="both"/>
+              <w:jc w:val="left"/>
               <w:rPr>
                 <w:sz w:val="24"/>
                 <w:szCs w:val="24"/>
@@ -5142,6 +5260,7 @@
       </w:tr>
       <w:tr>
         <w:trPr>
+          <w:cantSplit/>
           <w:jc w:val="center"/>
         </w:trPr>
         <w:tc>
@@ -5213,7 +5332,7 @@
           </w:tcPr>
           <w:p>
             <w:pPr>
-              <w:jc w:val="both"/>
+              <w:jc w:val="left"/>
               <w:rPr>
                 <w:sz w:val="24"/>
                 <w:szCs w:val="24"/>
@@ -5242,7 +5361,7 @@
           </w:tcPr>
           <w:p>
             <w:pPr>
-              <w:jc w:val="both"/>
+              <w:jc w:val="left"/>
               <w:rPr>
                 <w:sz w:val="24"/>
                 <w:szCs w:val="24"/>
@@ -5271,7 +5390,7 @@
           </w:tcPr>
           <w:p>
             <w:pPr>
-              <w:jc w:val="both"/>
+              <w:jc w:val="left"/>
               <w:rPr>
                 <w:sz w:val="24"/>
                 <w:szCs w:val="24"/>
@@ -5290,6 +5409,7 @@
       </w:tr>
       <w:tr>
         <w:trPr>
+          <w:cantSplit/>
           <w:jc w:val="center"/>
         </w:trPr>
         <w:tc>
@@ -5361,7 +5481,7 @@
           </w:tcPr>
           <w:p>
             <w:pPr>
-              <w:jc w:val="both"/>
+              <w:jc w:val="left"/>
               <w:rPr>
                 <w:sz w:val="24"/>
                 <w:szCs w:val="24"/>
@@ -5390,7 +5510,7 @@
           </w:tcPr>
           <w:p>
             <w:pPr>
-              <w:jc w:val="both"/>
+              <w:jc w:val="left"/>
               <w:rPr>
                 <w:sz w:val="24"/>
                 <w:szCs w:val="24"/>
@@ -5419,7 +5539,7 @@
           </w:tcPr>
           <w:p>
             <w:pPr>
-              <w:jc w:val="both"/>
+              <w:jc w:val="left"/>
               <w:rPr>
                 <w:sz w:val="24"/>
                 <w:szCs w:val="24"/>
@@ -5438,6 +5558,7 @@
       </w:tr>
       <w:tr>
         <w:trPr>
+          <w:cantSplit/>
           <w:jc w:val="center"/>
         </w:trPr>
         <w:tc>
@@ -5509,7 +5630,7 @@
           </w:tcPr>
           <w:p>
             <w:pPr>
-              <w:jc w:val="both"/>
+              <w:jc w:val="left"/>
               <w:rPr>
                 <w:sz w:val="24"/>
                 <w:szCs w:val="24"/>
@@ -5538,7 +5659,7 @@
           </w:tcPr>
           <w:p>
             <w:pPr>
-              <w:jc w:val="both"/>
+              <w:jc w:val="left"/>
               <w:rPr>
                 <w:sz w:val="24"/>
                 <w:szCs w:val="24"/>
@@ -5567,7 +5688,7 @@
           </w:tcPr>
           <w:p>
             <w:pPr>
-              <w:jc w:val="both"/>
+              <w:jc w:val="left"/>
               <w:rPr>
                 <w:sz w:val="24"/>
                 <w:szCs w:val="24"/>
@@ -5586,6 +5707,7 @@
       </w:tr>
       <w:tr>
         <w:trPr>
+          <w:cantSplit/>
           <w:jc w:val="center"/>
         </w:trPr>
         <w:tc>
@@ -5657,7 +5779,7 @@
           </w:tcPr>
           <w:p>
             <w:pPr>
-              <w:jc w:val="both"/>
+              <w:jc w:val="left"/>
               <w:rPr>
                 <w:sz w:val="24"/>
                 <w:szCs w:val="24"/>
@@ -5686,7 +5808,7 @@
           </w:tcPr>
           <w:p>
             <w:pPr>
-              <w:jc w:val="both"/>
+              <w:jc w:val="left"/>
               <w:rPr>
                 <w:sz w:val="24"/>
                 <w:szCs w:val="24"/>
@@ -5715,7 +5837,7 @@
           </w:tcPr>
           <w:p>
             <w:pPr>
-              <w:jc w:val="both"/>
+              <w:jc w:val="left"/>
               <w:rPr>
                 <w:sz w:val="24"/>
                 <w:szCs w:val="24"/>
@@ -5734,6 +5856,7 @@
       </w:tr>
       <w:tr>
         <w:trPr>
+          <w:cantSplit/>
           <w:jc w:val="center"/>
         </w:trPr>
         <w:tc>
@@ -5805,7 +5928,7 @@
           </w:tcPr>
           <w:p>
             <w:pPr>
-              <w:jc w:val="both"/>
+              <w:jc w:val="left"/>
               <w:rPr>
                 <w:sz w:val="24"/>
                 <w:szCs w:val="24"/>
@@ -5834,7 +5957,7 @@
           </w:tcPr>
           <w:p>
             <w:pPr>
-              <w:jc w:val="both"/>
+              <w:jc w:val="left"/>
               <w:rPr>
                 <w:sz w:val="24"/>
                 <w:szCs w:val="24"/>
@@ -5863,7 +5986,7 @@
           </w:tcPr>
           <w:p>
             <w:pPr>
-              <w:jc w:val="both"/>
+              <w:jc w:val="left"/>
               <w:rPr>
                 <w:sz w:val="24"/>
                 <w:szCs w:val="24"/>
@@ -5882,6 +6005,7 @@
       </w:tr>
       <w:tr>
         <w:trPr>
+          <w:cantSplit/>
           <w:jc w:val="center"/>
         </w:trPr>
         <w:tc>
@@ -5953,7 +6077,7 @@
           </w:tcPr>
           <w:p>
             <w:pPr>
-              <w:jc w:val="both"/>
+              <w:jc w:val="left"/>
               <w:rPr>
                 <w:sz w:val="24"/>
                 <w:szCs w:val="24"/>
@@ -5982,7 +6106,7 @@
           </w:tcPr>
           <w:p>
             <w:pPr>
-              <w:jc w:val="both"/>
+              <w:jc w:val="left"/>
               <w:rPr>
                 <w:sz w:val="24"/>
                 <w:szCs w:val="24"/>
@@ -6011,7 +6135,7 @@
           </w:tcPr>
           <w:p>
             <w:pPr>
-              <w:jc w:val="both"/>
+              <w:jc w:val="left"/>
               <w:rPr>
                 <w:sz w:val="24"/>
                 <w:szCs w:val="24"/>
@@ -6030,6 +6154,7 @@
       </w:tr>
       <w:tr>
         <w:trPr>
+          <w:cantSplit/>
           <w:jc w:val="center"/>
         </w:trPr>
         <w:tc>
@@ -6101,7 +6226,7 @@
           </w:tcPr>
           <w:p>
             <w:pPr>
-              <w:jc w:val="both"/>
+              <w:jc w:val="left"/>
               <w:rPr>
                 <w:sz w:val="24"/>
                 <w:szCs w:val="24"/>
@@ -6130,7 +6255,7 @@
           </w:tcPr>
           <w:p>
             <w:pPr>
-              <w:jc w:val="both"/>
+              <w:jc w:val="left"/>
               <w:rPr>
                 <w:sz w:val="24"/>
                 <w:szCs w:val="24"/>
@@ -6159,7 +6284,7 @@
           </w:tcPr>
           <w:p>
             <w:pPr>
-              <w:jc w:val="both"/>
+              <w:jc w:val="left"/>
               <w:rPr>
                 <w:sz w:val="24"/>
                 <w:szCs w:val="24"/>
@@ -6178,6 +6303,7 @@
       </w:tr>
       <w:tr>
         <w:trPr>
+          <w:cantSplit/>
           <w:jc w:val="center"/>
         </w:trPr>
         <w:tc>
@@ -6249,7 +6375,7 @@
           </w:tcPr>
           <w:p>
             <w:pPr>
-              <w:jc w:val="both"/>
+              <w:jc w:val="left"/>
               <w:rPr>
                 <w:sz w:val="24"/>
                 <w:szCs w:val="24"/>
@@ -6278,7 +6404,7 @@
           </w:tcPr>
           <w:p>
             <w:pPr>
-              <w:jc w:val="both"/>
+              <w:jc w:val="left"/>
               <w:rPr>
                 <w:sz w:val="24"/>
                 <w:szCs w:val="24"/>
@@ -6307,7 +6433,7 @@
           </w:tcPr>
           <w:p>
             <w:pPr>
-              <w:jc w:val="both"/>
+              <w:jc w:val="left"/>
               <w:rPr>
                 <w:sz w:val="24"/>
                 <w:szCs w:val="24"/>
@@ -6326,6 +6452,7 @@
       </w:tr>
       <w:tr>
         <w:trPr>
+          <w:cantSplit/>
           <w:jc w:val="center"/>
         </w:trPr>
         <w:tc>
@@ -6397,7 +6524,7 @@
           </w:tcPr>
           <w:p>
             <w:pPr>
-              <w:jc w:val="both"/>
+              <w:jc w:val="left"/>
               <w:rPr>
                 <w:sz w:val="24"/>
                 <w:szCs w:val="24"/>
@@ -6426,7 +6553,7 @@
           </w:tcPr>
           <w:p>
             <w:pPr>
-              <w:jc w:val="both"/>
+              <w:jc w:val="left"/>
               <w:rPr>
                 <w:sz w:val="24"/>
                 <w:szCs w:val="24"/>
@@ -6455,7 +6582,7 @@
           </w:tcPr>
           <w:p>
             <w:pPr>
-              <w:jc w:val="both"/>
+              <w:jc w:val="left"/>
               <w:rPr>
                 <w:sz w:val="24"/>
                 <w:szCs w:val="24"/>
@@ -6474,6 +6601,7 @@
       </w:tr>
       <w:tr>
         <w:trPr>
+          <w:cantSplit/>
           <w:jc w:val="center"/>
         </w:trPr>
         <w:tc>
@@ -6545,7 +6673,7 @@
           </w:tcPr>
           <w:p>
             <w:pPr>
-              <w:jc w:val="both"/>
+              <w:jc w:val="left"/>
               <w:rPr>
                 <w:sz w:val="24"/>
                 <w:szCs w:val="24"/>
@@ -6574,7 +6702,7 @@
           </w:tcPr>
           <w:p>
             <w:pPr>
-              <w:jc w:val="both"/>
+              <w:jc w:val="left"/>
               <w:rPr>
                 <w:sz w:val="24"/>
                 <w:szCs w:val="24"/>
@@ -6603,7 +6731,7 @@
           </w:tcPr>
           <w:p>
             <w:pPr>
-              <w:jc w:val="both"/>
+              <w:jc w:val="left"/>
               <w:rPr>
                 <w:sz w:val="24"/>
                 <w:szCs w:val="24"/>
@@ -6666,7 +6794,7 @@
           <w:sz w:val="24"/>
           <w:szCs w:val="24"/>
         </w:rPr>
-        <w:t xml:space="preserve">JA-08 dan JA-09 memakai nama jabatan yang sama. Pembedanya garis lapor: JA-09 melapor ke JA-08. Nama unit dan nama jabatan JA-14 mengikuti butir K-06.</w:t>
+        <w:t xml:space="preserve">JA-08 dan JA-09 memakai nama jabatan yang sama dan dibedakan oleh garis lapor: JA-09 melapor ke JA-08. Nama unit dan nama jabatan JA-14 mengikuti butir K-06.</w:t>
       </w:r>
     </w:p>
     <w:p>
@@ -6766,6 +6894,7 @@
     </w:p>
     <w:p>
       <w:pPr>
+        <w:keepNext/>
         <w:pBdr>
           <w:top w:val="nil"/>
           <w:left w:val="nil"/>
@@ -6806,6 +6935,8 @@
       </w:tblGrid>
       <w:tr>
         <w:trPr>
+          <w:cantSplit/>
+          <w:tblHeader/>
           <w:jc w:val="center"/>
         </w:trPr>
         <w:tc>
@@ -6821,6 +6952,7 @@
           </w:tcPr>
           <w:p>
             <w:pPr>
+              <w:keepNext/>
               <w:jc w:val="center"/>
               <w:rPr>
                 <w:sz w:val="24"/>
@@ -6851,6 +6983,7 @@
           </w:tcPr>
           <w:p>
             <w:pPr>
+              <w:keepNext/>
               <w:jc w:val="center"/>
               <w:rPr>
                 <w:sz w:val="24"/>
@@ -6881,6 +7014,7 @@
           </w:tcPr>
           <w:p>
             <w:pPr>
+              <w:keepNext/>
               <w:jc w:val="center"/>
               <w:rPr>
                 <w:sz w:val="24"/>
@@ -6911,6 +7045,7 @@
           </w:tcPr>
           <w:p>
             <w:pPr>
+              <w:keepNext/>
               <w:jc w:val="center"/>
               <w:rPr>
                 <w:sz w:val="24"/>
@@ -6941,6 +7076,7 @@
           </w:tcPr>
           <w:p>
             <w:pPr>
+              <w:keepNext/>
               <w:jc w:val="center"/>
               <w:rPr>
                 <w:sz w:val="24"/>
@@ -6961,6 +7097,7 @@
       </w:tr>
       <w:tr>
         <w:trPr>
+          <w:cantSplit/>
           <w:jc w:val="center"/>
         </w:trPr>
         <w:tc>
@@ -7032,7 +7169,7 @@
           </w:tcPr>
           <w:p>
             <w:pPr>
-              <w:jc w:val="both"/>
+              <w:jc w:val="left"/>
               <w:rPr>
                 <w:sz w:val="24"/>
                 <w:szCs w:val="24"/>
@@ -7061,7 +7198,7 @@
           </w:tcPr>
           <w:p>
             <w:pPr>
-              <w:jc w:val="both"/>
+              <w:jc w:val="left"/>
               <w:rPr>
                 <w:sz w:val="24"/>
                 <w:szCs w:val="24"/>
@@ -7090,7 +7227,7 @@
           </w:tcPr>
           <w:p>
             <w:pPr>
-              <w:jc w:val="both"/>
+              <w:jc w:val="left"/>
               <w:rPr>
                 <w:sz w:val="24"/>
                 <w:szCs w:val="24"/>
@@ -7109,6 +7246,7 @@
       </w:tr>
       <w:tr>
         <w:trPr>
+          <w:cantSplit/>
           <w:jc w:val="center"/>
         </w:trPr>
         <w:tc>
@@ -7180,7 +7318,7 @@
           </w:tcPr>
           <w:p>
             <w:pPr>
-              <w:jc w:val="both"/>
+              <w:jc w:val="left"/>
               <w:rPr>
                 <w:sz w:val="24"/>
                 <w:szCs w:val="24"/>
@@ -7209,7 +7347,7 @@
           </w:tcPr>
           <w:p>
             <w:pPr>
-              <w:jc w:val="both"/>
+              <w:jc w:val="left"/>
               <w:rPr>
                 <w:sz w:val="24"/>
                 <w:szCs w:val="24"/>
@@ -7238,7 +7376,7 @@
           </w:tcPr>
           <w:p>
             <w:pPr>
-              <w:jc w:val="both"/>
+              <w:jc w:val="left"/>
               <w:rPr>
                 <w:sz w:val="24"/>
                 <w:szCs w:val="24"/>
@@ -7257,6 +7395,7 @@
       </w:tr>
       <w:tr>
         <w:trPr>
+          <w:cantSplit/>
           <w:jc w:val="center"/>
         </w:trPr>
         <w:tc>
@@ -7328,7 +7467,7 @@
           </w:tcPr>
           <w:p>
             <w:pPr>
-              <w:jc w:val="both"/>
+              <w:jc w:val="left"/>
               <w:rPr>
                 <w:sz w:val="24"/>
                 <w:szCs w:val="24"/>
@@ -7357,7 +7496,7 @@
           </w:tcPr>
           <w:p>
             <w:pPr>
-              <w:jc w:val="both"/>
+              <w:jc w:val="left"/>
               <w:rPr>
                 <w:sz w:val="24"/>
                 <w:szCs w:val="24"/>
@@ -7386,7 +7525,7 @@
           </w:tcPr>
           <w:p>
             <w:pPr>
-              <w:jc w:val="both"/>
+              <w:jc w:val="left"/>
               <w:rPr>
                 <w:sz w:val="24"/>
                 <w:szCs w:val="24"/>
@@ -7405,6 +7544,7 @@
       </w:tr>
       <w:tr>
         <w:trPr>
+          <w:cantSplit/>
           <w:jc w:val="center"/>
         </w:trPr>
         <w:tc>
@@ -7476,7 +7616,7 @@
           </w:tcPr>
           <w:p>
             <w:pPr>
-              <w:jc w:val="both"/>
+              <w:jc w:val="left"/>
               <w:rPr>
                 <w:sz w:val="24"/>
                 <w:szCs w:val="24"/>
@@ -7505,7 +7645,7 @@
           </w:tcPr>
           <w:p>
             <w:pPr>
-              <w:jc w:val="both"/>
+              <w:jc w:val="left"/>
               <w:rPr>
                 <w:sz w:val="24"/>
                 <w:szCs w:val="24"/>
@@ -7534,7 +7674,7 @@
           </w:tcPr>
           <w:p>
             <w:pPr>
-              <w:jc w:val="both"/>
+              <w:jc w:val="left"/>
               <w:rPr>
                 <w:sz w:val="24"/>
                 <w:szCs w:val="24"/>
@@ -7553,6 +7693,7 @@
       </w:tr>
       <w:tr>
         <w:trPr>
+          <w:cantSplit/>
           <w:jc w:val="center"/>
         </w:trPr>
         <w:tc>
@@ -7624,7 +7765,7 @@
           </w:tcPr>
           <w:p>
             <w:pPr>
-              <w:jc w:val="both"/>
+              <w:jc w:val="left"/>
               <w:rPr>
                 <w:sz w:val="24"/>
                 <w:szCs w:val="24"/>
@@ -7653,7 +7794,7 @@
           </w:tcPr>
           <w:p>
             <w:pPr>
-              <w:jc w:val="both"/>
+              <w:jc w:val="left"/>
               <w:rPr>
                 <w:sz w:val="24"/>
                 <w:szCs w:val="24"/>
@@ -7682,7 +7823,7 @@
           </w:tcPr>
           <w:p>
             <w:pPr>
-              <w:jc w:val="both"/>
+              <w:jc w:val="left"/>
               <w:rPr>
                 <w:sz w:val="24"/>
                 <w:szCs w:val="24"/>
@@ -7701,6 +7842,7 @@
       </w:tr>
       <w:tr>
         <w:trPr>
+          <w:cantSplit/>
           <w:jc w:val="center"/>
         </w:trPr>
         <w:tc>
@@ -7772,7 +7914,7 @@
           </w:tcPr>
           <w:p>
             <w:pPr>
-              <w:jc w:val="both"/>
+              <w:jc w:val="left"/>
               <w:rPr>
                 <w:sz w:val="24"/>
                 <w:szCs w:val="24"/>
@@ -7801,7 +7943,7 @@
           </w:tcPr>
           <w:p>
             <w:pPr>
-              <w:jc w:val="both"/>
+              <w:jc w:val="left"/>
               <w:rPr>
                 <w:sz w:val="24"/>
                 <w:szCs w:val="24"/>
@@ -7830,7 +7972,7 @@
           </w:tcPr>
           <w:p>
             <w:pPr>
-              <w:jc w:val="both"/>
+              <w:jc w:val="left"/>
               <w:rPr>
                 <w:sz w:val="24"/>
                 <w:szCs w:val="24"/>
@@ -7849,6 +7991,7 @@
       </w:tr>
       <w:tr>
         <w:trPr>
+          <w:cantSplit/>
           <w:jc w:val="center"/>
         </w:trPr>
         <w:tc>
@@ -7920,7 +8063,7 @@
           </w:tcPr>
           <w:p>
             <w:pPr>
-              <w:jc w:val="both"/>
+              <w:jc w:val="left"/>
               <w:rPr>
                 <w:sz w:val="24"/>
                 <w:szCs w:val="24"/>
@@ -7949,7 +8092,7 @@
           </w:tcPr>
           <w:p>
             <w:pPr>
-              <w:jc w:val="both"/>
+              <w:jc w:val="left"/>
               <w:rPr>
                 <w:sz w:val="24"/>
                 <w:szCs w:val="24"/>
@@ -7978,7 +8121,7 @@
           </w:tcPr>
           <w:p>
             <w:pPr>
-              <w:jc w:val="both"/>
+              <w:jc w:val="left"/>
               <w:rPr>
                 <w:sz w:val="24"/>
                 <w:szCs w:val="24"/>
@@ -7997,6 +8140,7 @@
       </w:tr>
       <w:tr>
         <w:trPr>
+          <w:cantSplit/>
           <w:jc w:val="center"/>
         </w:trPr>
         <w:tc>
@@ -8023,7 +8167,7 @@
                 <w:sz w:val="24"/>
                 <w:szCs w:val="24"/>
               </w:rPr>
-              <w:t>Project Coordinator (opsional bila volume proyek tinggi)</w:t>
+              <w:t>Project Coordinator (opsional jika volume proyek tinggi)</w:t>
             </w:r>
           </w:p>
         </w:tc>
@@ -8068,7 +8212,7 @@
           </w:tcPr>
           <w:p>
             <w:pPr>
-              <w:jc w:val="both"/>
+              <w:jc w:val="left"/>
               <w:rPr>
                 <w:sz w:val="24"/>
                 <w:szCs w:val="24"/>
@@ -8097,7 +8241,7 @@
           </w:tcPr>
           <w:p>
             <w:pPr>
-              <w:jc w:val="both"/>
+              <w:jc w:val="left"/>
               <w:rPr>
                 <w:sz w:val="24"/>
                 <w:szCs w:val="24"/>
@@ -8126,7 +8270,7 @@
           </w:tcPr>
           <w:p>
             <w:pPr>
-              <w:jc w:val="both"/>
+              <w:jc w:val="left"/>
               <w:rPr>
                 <w:sz w:val="24"/>
                 <w:szCs w:val="24"/>
@@ -8207,6 +8351,7 @@
     </w:p>
     <w:p>
       <w:pPr>
+        <w:keepNext/>
         <w:pBdr>
           <w:top w:val="nil"/>
           <w:left w:val="nil"/>
@@ -8226,7 +8371,7 @@
           <w:sz w:val="24"/>
           <w:szCs w:val="24"/>
         </w:rPr>
-        <w:t xml:space="preserve">Matriks ini memasangkan peran yang dipakai dokumen SOP dengan jabatan pemegangnya. Tanggung jawab lengkap tiap jabatan ada di SNX-HR-JA-01 dan POL-OPS-001; kolom Dasar menunjuk dokumen asalnya.</w:t>
+        <w:t xml:space="preserve">Matriks ini memasangkan peran di dokumen SOP dengan jabatan pemegangnya. Tanggung jawab lengkap tiap jabatan tercantum di SNX-HR-JA-01 dan POL-OPS-001; kolom Dasar menyebut dokumen asalnya.</w:t>
       </w:r>
     </w:p>
     <w:tbl>
@@ -8246,6 +8391,8 @@
       </w:tblGrid>
       <w:tr>
         <w:trPr>
+          <w:cantSplit/>
+          <w:tblHeader/>
           <w:jc w:val="center"/>
         </w:trPr>
         <w:tc>
@@ -8261,6 +8408,7 @@
           </w:tcPr>
           <w:p>
             <w:pPr>
+              <w:keepNext/>
               <w:jc w:val="center"/>
               <w:rPr>
                 <w:sz w:val="24"/>
@@ -8291,6 +8439,7 @@
           </w:tcPr>
           <w:p>
             <w:pPr>
+              <w:keepNext/>
               <w:jc w:val="center"/>
               <w:rPr>
                 <w:sz w:val="24"/>
@@ -8321,6 +8470,7 @@
           </w:tcPr>
           <w:p>
             <w:pPr>
+              <w:keepNext/>
               <w:jc w:val="center"/>
               <w:rPr>
                 <w:sz w:val="24"/>
@@ -8351,6 +8501,7 @@
           </w:tcPr>
           <w:p>
             <w:pPr>
+              <w:keepNext/>
               <w:jc w:val="center"/>
               <w:rPr>
                 <w:sz w:val="24"/>
@@ -8371,6 +8522,7 @@
       </w:tr>
       <w:tr>
         <w:trPr>
+          <w:cantSplit/>
           <w:jc w:val="center"/>
         </w:trPr>
         <w:tc>
@@ -8442,7 +8594,7 @@
           </w:tcPr>
           <w:p>
             <w:pPr>
-              <w:jc w:val="both"/>
+              <w:jc w:val="left"/>
               <w:rPr>
                 <w:sz w:val="24"/>
                 <w:szCs w:val="24"/>
@@ -8471,7 +8623,7 @@
           </w:tcPr>
           <w:p>
             <w:pPr>
-              <w:jc w:val="both"/>
+              <w:jc w:val="left"/>
               <w:rPr>
                 <w:sz w:val="24"/>
                 <w:szCs w:val="24"/>
@@ -8490,6 +8642,7 @@
       </w:tr>
       <w:tr>
         <w:trPr>
+          <w:cantSplit/>
           <w:jc w:val="center"/>
         </w:trPr>
         <w:tc>
@@ -8561,7 +8714,7 @@
           </w:tcPr>
           <w:p>
             <w:pPr>
-              <w:jc w:val="both"/>
+              <w:jc w:val="left"/>
               <w:rPr>
                 <w:sz w:val="24"/>
                 <w:szCs w:val="24"/>
@@ -8590,7 +8743,7 @@
           </w:tcPr>
           <w:p>
             <w:pPr>
-              <w:jc w:val="both"/>
+              <w:jc w:val="left"/>
               <w:rPr>
                 <w:sz w:val="24"/>
                 <w:szCs w:val="24"/>
@@ -8609,6 +8762,7 @@
       </w:tr>
       <w:tr>
         <w:trPr>
+          <w:cantSplit/>
           <w:jc w:val="center"/>
         </w:trPr>
         <w:tc>
@@ -8635,7 +8789,7 @@
                 <w:sz w:val="24"/>
                 <w:szCs w:val="24"/>
               </w:rPr>
-              <w:t>Penetap kebijakan mutu, sasaran mutu, dan sumber daya; pemimpin tinjauan manajemen</w:t>
+              <w:t>Penetap kebijakan mutu, sasaran mutu, dan sumber daya; pemimpin Management Review</w:t>
             </w:r>
           </w:p>
         </w:tc>
@@ -8680,7 +8834,7 @@
           </w:tcPr>
           <w:p>
             <w:pPr>
-              <w:jc w:val="both"/>
+              <w:jc w:val="left"/>
               <w:rPr>
                 <w:sz w:val="24"/>
                 <w:szCs w:val="24"/>
@@ -8709,7 +8863,7 @@
           </w:tcPr>
           <w:p>
             <w:pPr>
-              <w:jc w:val="both"/>
+              <w:jc w:val="left"/>
               <w:rPr>
                 <w:sz w:val="24"/>
                 <w:szCs w:val="24"/>
@@ -8728,6 +8882,7 @@
       </w:tr>
       <w:tr>
         <w:trPr>
+          <w:cantSplit/>
           <w:jc w:val="center"/>
         </w:trPr>
         <w:tc>
@@ -8799,7 +8954,7 @@
           </w:tcPr>
           <w:p>
             <w:pPr>
-              <w:jc w:val="both"/>
+              <w:jc w:val="left"/>
               <w:rPr>
                 <w:sz w:val="24"/>
                 <w:szCs w:val="24"/>
@@ -8828,7 +8983,7 @@
           </w:tcPr>
           <w:p>
             <w:pPr>
-              <w:jc w:val="both"/>
+              <w:jc w:val="left"/>
               <w:rPr>
                 <w:sz w:val="24"/>
                 <w:szCs w:val="24"/>
@@ -8847,6 +9002,7 @@
       </w:tr>
       <w:tr>
         <w:trPr>
+          <w:cantSplit/>
           <w:jc w:val="center"/>
         </w:trPr>
         <w:tc>
@@ -8918,7 +9074,7 @@
           </w:tcPr>
           <w:p>
             <w:pPr>
-              <w:jc w:val="both"/>
+              <w:jc w:val="left"/>
               <w:rPr>
                 <w:sz w:val="24"/>
                 <w:szCs w:val="24"/>
@@ -8947,7 +9103,7 @@
           </w:tcPr>
           <w:p>
             <w:pPr>
-              <w:jc w:val="both"/>
+              <w:jc w:val="left"/>
               <w:rPr>
                 <w:sz w:val="24"/>
                 <w:szCs w:val="24"/>
@@ -8966,6 +9122,7 @@
       </w:tr>
       <w:tr>
         <w:trPr>
+          <w:cantSplit/>
           <w:jc w:val="center"/>
         </w:trPr>
         <w:tc>
@@ -9037,7 +9194,7 @@
           </w:tcPr>
           <w:p>
             <w:pPr>
-              <w:jc w:val="both"/>
+              <w:jc w:val="left"/>
               <w:rPr>
                 <w:sz w:val="24"/>
                 <w:szCs w:val="24"/>
@@ -9066,7 +9223,7 @@
           </w:tcPr>
           <w:p>
             <w:pPr>
-              <w:jc w:val="both"/>
+              <w:jc w:val="left"/>
               <w:rPr>
                 <w:sz w:val="24"/>
                 <w:szCs w:val="24"/>
@@ -9085,6 +9242,7 @@
       </w:tr>
       <w:tr>
         <w:trPr>
+          <w:cantSplit/>
           <w:jc w:val="center"/>
         </w:trPr>
         <w:tc>
@@ -9156,7 +9314,7 @@
           </w:tcPr>
           <w:p>
             <w:pPr>
-              <w:jc w:val="both"/>
+              <w:jc w:val="left"/>
               <w:rPr>
                 <w:sz w:val="24"/>
                 <w:szCs w:val="24"/>
@@ -9185,7 +9343,7 @@
           </w:tcPr>
           <w:p>
             <w:pPr>
-              <w:jc w:val="both"/>
+              <w:jc w:val="left"/>
               <w:rPr>
                 <w:sz w:val="24"/>
                 <w:szCs w:val="24"/>
@@ -9204,6 +9362,7 @@
       </w:tr>
       <w:tr>
         <w:trPr>
+          <w:cantSplit/>
           <w:jc w:val="center"/>
         </w:trPr>
         <w:tc>
@@ -9275,7 +9434,7 @@
           </w:tcPr>
           <w:p>
             <w:pPr>
-              <w:jc w:val="both"/>
+              <w:jc w:val="left"/>
               <w:rPr>
                 <w:sz w:val="24"/>
                 <w:szCs w:val="24"/>
@@ -9304,7 +9463,7 @@
           </w:tcPr>
           <w:p>
             <w:pPr>
-              <w:jc w:val="both"/>
+              <w:jc w:val="left"/>
               <w:rPr>
                 <w:sz w:val="24"/>
                 <w:szCs w:val="24"/>
@@ -9323,6 +9482,7 @@
       </w:tr>
       <w:tr>
         <w:trPr>
+          <w:cantSplit/>
           <w:jc w:val="center"/>
         </w:trPr>
         <w:tc>
@@ -9394,7 +9554,7 @@
           </w:tcPr>
           <w:p>
             <w:pPr>
-              <w:jc w:val="both"/>
+              <w:jc w:val="left"/>
               <w:rPr>
                 <w:sz w:val="24"/>
                 <w:szCs w:val="24"/>
@@ -9423,7 +9583,7 @@
           </w:tcPr>
           <w:p>
             <w:pPr>
-              <w:jc w:val="both"/>
+              <w:jc w:val="left"/>
               <w:rPr>
                 <w:sz w:val="24"/>
                 <w:szCs w:val="24"/>
@@ -9442,6 +9602,7 @@
       </w:tr>
       <w:tr>
         <w:trPr>
+          <w:cantSplit/>
           <w:jc w:val="center"/>
         </w:trPr>
         <w:tc>
@@ -9513,7 +9674,7 @@
           </w:tcPr>
           <w:p>
             <w:pPr>
-              <w:jc w:val="both"/>
+              <w:jc w:val="left"/>
               <w:rPr>
                 <w:sz w:val="24"/>
                 <w:szCs w:val="24"/>
@@ -9542,7 +9703,7 @@
           </w:tcPr>
           <w:p>
             <w:pPr>
-              <w:jc w:val="both"/>
+              <w:jc w:val="left"/>
               <w:rPr>
                 <w:sz w:val="24"/>
                 <w:szCs w:val="24"/>
@@ -9561,6 +9722,7 @@
       </w:tr>
       <w:tr>
         <w:trPr>
+          <w:cantSplit/>
           <w:jc w:val="center"/>
         </w:trPr>
         <w:tc>
@@ -9632,7 +9794,7 @@
           </w:tcPr>
           <w:p>
             <w:pPr>
-              <w:jc w:val="both"/>
+              <w:jc w:val="left"/>
               <w:rPr>
                 <w:sz w:val="24"/>
                 <w:szCs w:val="24"/>
@@ -9661,7 +9823,7 @@
           </w:tcPr>
           <w:p>
             <w:pPr>
-              <w:jc w:val="both"/>
+              <w:jc w:val="left"/>
               <w:rPr>
                 <w:sz w:val="24"/>
                 <w:szCs w:val="24"/>
@@ -9680,6 +9842,7 @@
       </w:tr>
       <w:tr>
         <w:trPr>
+          <w:cantSplit/>
           <w:jc w:val="center"/>
         </w:trPr>
         <w:tc>
@@ -9751,7 +9914,7 @@
           </w:tcPr>
           <w:p>
             <w:pPr>
-              <w:jc w:val="both"/>
+              <w:jc w:val="left"/>
               <w:rPr>
                 <w:sz w:val="24"/>
                 <w:szCs w:val="24"/>
@@ -9780,7 +9943,7 @@
           </w:tcPr>
           <w:p>
             <w:pPr>
-              <w:jc w:val="both"/>
+              <w:jc w:val="left"/>
               <w:rPr>
                 <w:sz w:val="24"/>
                 <w:szCs w:val="24"/>
@@ -9799,6 +9962,7 @@
       </w:tr>
       <w:tr>
         <w:trPr>
+          <w:cantSplit/>
           <w:jc w:val="center"/>
         </w:trPr>
         <w:tc>
@@ -9870,7 +10034,7 @@
           </w:tcPr>
           <w:p>
             <w:pPr>
-              <w:jc w:val="both"/>
+              <w:jc w:val="left"/>
               <w:rPr>
                 <w:sz w:val="24"/>
                 <w:szCs w:val="24"/>
@@ -9899,7 +10063,7 @@
           </w:tcPr>
           <w:p>
             <w:pPr>
-              <w:jc w:val="both"/>
+              <w:jc w:val="left"/>
               <w:rPr>
                 <w:sz w:val="24"/>
                 <w:szCs w:val="24"/>
@@ -9918,6 +10082,7 @@
       </w:tr>
       <w:tr>
         <w:trPr>
+          <w:cantSplit/>
           <w:jc w:val="center"/>
         </w:trPr>
         <w:tc>
@@ -9989,7 +10154,7 @@
           </w:tcPr>
           <w:p>
             <w:pPr>
-              <w:jc w:val="both"/>
+              <w:jc w:val="left"/>
               <w:rPr>
                 <w:sz w:val="24"/>
                 <w:szCs w:val="24"/>
@@ -10018,7 +10183,7 @@
           </w:tcPr>
           <w:p>
             <w:pPr>
-              <w:jc w:val="both"/>
+              <w:jc w:val="left"/>
               <w:rPr>
                 <w:sz w:val="24"/>
                 <w:szCs w:val="24"/>
@@ -10081,7 +10246,7 @@
           <w:sz w:val="24"/>
           <w:szCs w:val="24"/>
         </w:rPr>
-        <w:t xml:space="preserve">Batas wewenang semua jabatan: keputusan keuangan, legal, perubahan kontrak, pengangkatan atau pemutusan hubungan kerja, dan perubahan sistem produksi tetap mengikuti delegasi dan persetujuan tertulis yang berlaku.</w:t>
+        <w:t xml:space="preserve">Untuk semua jabatan, keputusan keuangan, legal, perubahan kontrak, pengangkatan atau pemutusan hubungan kerja, serta perubahan sistem produksi tetap mengikuti delegasi dan persetujuan tertulis yang berlaku.</w:t>
       </w:r>
     </w:p>
     <w:p>
@@ -10099,6 +10264,7 @@
     </w:p>
     <w:p>
       <w:pPr>
+        <w:keepNext/>
         <w:pBdr>
           <w:top w:val="nil"/>
           <w:left w:val="nil"/>
@@ -10137,6 +10303,8 @@
       </w:tblGrid>
       <w:tr>
         <w:trPr>
+          <w:cantSplit/>
+          <w:tblHeader/>
           <w:jc w:val="center"/>
         </w:trPr>
         <w:tc>
@@ -10152,6 +10320,7 @@
           </w:tcPr>
           <w:p>
             <w:pPr>
+              <w:keepNext/>
               <w:jc w:val="center"/>
               <w:rPr>
                 <w:sz w:val="24"/>
@@ -10182,6 +10351,7 @@
           </w:tcPr>
           <w:p>
             <w:pPr>
+              <w:keepNext/>
               <w:jc w:val="center"/>
               <w:rPr>
                 <w:sz w:val="24"/>
@@ -10212,6 +10382,7 @@
           </w:tcPr>
           <w:p>
             <w:pPr>
+              <w:keepNext/>
               <w:jc w:val="center"/>
               <w:rPr>
                 <w:sz w:val="24"/>
@@ -10232,6 +10403,7 @@
       </w:tr>
       <w:tr>
         <w:trPr>
+          <w:cantSplit/>
           <w:jc w:val="center"/>
         </w:trPr>
         <w:tc>
@@ -10303,25 +10475,26 @@
           </w:tcPr>
           <w:p>
             <w:pPr>
-              <w:jc w:val="both"/>
-              <w:rPr>
-                <w:sz w:val="24"/>
-                <w:szCs w:val="24"/>
-              </w:rPr>
-            </w:pPr>
-            <w:r>
-              <w:rPr>
-                <w:b w:val="0"/>
-                <w:sz w:val="24"/>
-                <w:szCs w:val="24"/>
-              </w:rPr>
-              <w:t>Sudah diputus: JA-03 dan JA-04 masing-masing melapor ke Direktur (JA-02) dan ke Direktur Utama (JA-01), dua garis tegas. Job Analysis hanya menulis atasan langsung Direktur untuk keduanya.</w:t>
+              <w:jc w:val="left"/>
+              <w:rPr>
+                <w:sz w:val="24"/>
+                <w:szCs w:val="24"/>
+              </w:rPr>
+            </w:pPr>
+            <w:r>
+              <w:rPr>
+                <w:b w:val="0"/>
+                <w:sz w:val="24"/>
+                <w:szCs w:val="24"/>
+              </w:rPr>
+              <w:t>Sudah diputus: JA-03 dan JA-04 masing-masing melapor ke Direktur (JA-02) dan ke Direktur Utama (JA-01) dengan dua garis tegas. Job Analysis hanya menulis Direktur sebagai atasan langsung keduanya.</w:t>
             </w:r>
           </w:p>
         </w:tc>
       </w:tr>
       <w:tr>
         <w:trPr>
+          <w:cantSplit/>
           <w:jc w:val="center"/>
         </w:trPr>
         <w:tc>
@@ -10393,7 +10566,7 @@
           </w:tcPr>
           <w:p>
             <w:pPr>
-              <w:jc w:val="both"/>
+              <w:jc w:val="left"/>
               <w:rPr>
                 <w:sz w:val="24"/>
                 <w:szCs w:val="24"/>
@@ -10412,6 +10585,7 @@
       </w:tr>
       <w:tr>
         <w:trPr>
+          <w:cantSplit/>
           <w:jc w:val="center"/>
         </w:trPr>
         <w:tc>
@@ -10483,7 +10657,7 @@
           </w:tcPr>
           <w:p>
             <w:pPr>
-              <w:jc w:val="both"/>
+              <w:jc w:val="left"/>
               <w:rPr>
                 <w:sz w:val="24"/>
                 <w:szCs w:val="24"/>
@@ -10502,6 +10676,7 @@
       </w:tr>
       <w:tr>
         <w:trPr>
+          <w:cantSplit/>
           <w:jc w:val="center"/>
         </w:trPr>
         <w:tc>
@@ -10573,7 +10748,7 @@
           </w:tcPr>
           <w:p>
             <w:pPr>
-              <w:jc w:val="both"/>
+              <w:jc w:val="left"/>
               <w:rPr>
                 <w:sz w:val="24"/>
                 <w:szCs w:val="24"/>
@@ -10592,6 +10767,7 @@
       </w:tr>
       <w:tr>
         <w:trPr>
+          <w:cantSplit/>
           <w:jc w:val="center"/>
         </w:trPr>
         <w:tc>
@@ -10663,7 +10839,7 @@
           </w:tcPr>
           <w:p>
             <w:pPr>
-              <w:jc w:val="both"/>
+              <w:jc w:val="left"/>
               <w:rPr>
                 <w:sz w:val="24"/>
                 <w:szCs w:val="24"/>
@@ -10682,6 +10858,7 @@
       </w:tr>
       <w:tr>
         <w:trPr>
+          <w:cantSplit/>
           <w:jc w:val="center"/>
         </w:trPr>
         <w:tc>
@@ -10753,7 +10930,7 @@
           </w:tcPr>
           <w:p>
             <w:pPr>
-              <w:jc w:val="both"/>
+              <w:jc w:val="left"/>
               <w:rPr>
                 <w:sz w:val="24"/>
                 <w:szCs w:val="24"/>
@@ -10772,6 +10949,7 @@
       </w:tr>
       <w:tr>
         <w:trPr>
+          <w:cantSplit/>
           <w:jc w:val="center"/>
         </w:trPr>
         <w:tc>
@@ -10843,7 +11021,7 @@
           </w:tcPr>
           <w:p>
             <w:pPr>
-              <w:jc w:val="both"/>
+              <w:jc w:val="left"/>
               <w:rPr>
                 <w:sz w:val="24"/>
                 <w:szCs w:val="24"/>
@@ -10862,6 +11040,7 @@
       </w:tr>
       <w:tr>
         <w:trPr>
+          <w:cantSplit/>
           <w:jc w:val="center"/>
         </w:trPr>
         <w:tc>
@@ -10933,7 +11112,7 @@
           </w:tcPr>
           <w:p>
             <w:pPr>
-              <w:jc w:val="both"/>
+              <w:jc w:val="left"/>
               <w:rPr>
                 <w:sz w:val="24"/>
                 <w:szCs w:val="24"/>
@@ -10952,6 +11131,7 @@
       </w:tr>
       <w:tr>
         <w:trPr>
+          <w:cantSplit/>
           <w:jc w:val="center"/>
         </w:trPr>
         <w:tc>
@@ -11023,7 +11203,7 @@
           </w:tcPr>
           <w:p>
             <w:pPr>
-              <w:jc w:val="both"/>
+              <w:jc w:val="left"/>
               <w:rPr>
                 <w:sz w:val="24"/>
                 <w:szCs w:val="24"/>
@@ -11042,6 +11222,7 @@
       </w:tr>
       <w:tr>
         <w:trPr>
+          <w:cantSplit/>
           <w:jc w:val="center"/>
         </w:trPr>
         <w:tc>
@@ -11113,7 +11294,7 @@
           </w:tcPr>
           <w:p>
             <w:pPr>
-              <w:jc w:val="both"/>
+              <w:jc w:val="left"/>
               <w:rPr>
                 <w:sz w:val="24"/>
                 <w:szCs w:val="24"/>
@@ -11132,6 +11313,7 @@
       </w:tr>
       <w:tr>
         <w:trPr>
+          <w:cantSplit/>
           <w:jc w:val="center"/>
         </w:trPr>
         <w:tc>
@@ -11203,7 +11385,7 @@
           </w:tcPr>
           <w:p>
             <w:pPr>
-              <w:jc w:val="both"/>
+              <w:jc w:val="left"/>
               <w:rPr>
                 <w:sz w:val="24"/>
                 <w:szCs w:val="24"/>
@@ -11222,6 +11404,7 @@
       </w:tr>
       <w:tr>
         <w:trPr>
+          <w:cantSplit/>
           <w:jc w:val="center"/>
         </w:trPr>
         <w:tc>
@@ -11293,7 +11476,7 @@
           </w:tcPr>
           <w:p>
             <w:pPr>
-              <w:jc w:val="both"/>
+              <w:jc w:val="left"/>
               <w:rPr>
                 <w:sz w:val="24"/>
                 <w:szCs w:val="24"/>
@@ -11312,6 +11495,7 @@
       </w:tr>
       <w:tr>
         <w:trPr>
+          <w:cantSplit/>
           <w:jc w:val="center"/>
         </w:trPr>
         <w:tc>
@@ -11383,7 +11567,7 @@
           </w:tcPr>
           <w:p>
             <w:pPr>
-              <w:jc w:val="both"/>
+              <w:jc w:val="left"/>
               <w:rPr>
                 <w:sz w:val="24"/>
                 <w:szCs w:val="24"/>
@@ -11402,6 +11586,7 @@
       </w:tr>
       <w:tr>
         <w:trPr>
+          <w:cantSplit/>
           <w:jc w:val="center"/>
         </w:trPr>
         <w:tc>
@@ -11473,7 +11658,7 @@
           </w:tcPr>
           <w:p>
             <w:pPr>
-              <w:jc w:val="both"/>
+              <w:jc w:val="left"/>
               <w:rPr>
                 <w:sz w:val="24"/>
                 <w:szCs w:val="24"/>
@@ -11530,6 +11715,7 @@
     </w:p>
     <w:p>
       <w:pPr>
+        <w:keepNext/>
         <w:pBdr>
           <w:top w:val="nil"/>
           <w:left w:val="nil"/>
@@ -11549,7 +11735,7 @@
           <w:sz w:val="24"/>
           <w:szCs w:val="24"/>
         </w:rPr>
-        <w:t xml:space="preserve">Daftar klausul berikut berstatus (USULAN, perlu konfirmasi konsultan).</w:t>
+        <w:t xml:space="preserve">Daftar klausul berikut masih perlu dikonfirmasi konsultan (USULAN).</w:t>
       </w:r>
     </w:p>
     <w:tbl>
@@ -11568,6 +11754,8 @@
       </w:tblGrid>
       <w:tr>
         <w:trPr>
+          <w:cantSplit/>
+          <w:tblHeader/>
           <w:jc w:val="center"/>
         </w:trPr>
         <w:tc>
@@ -11583,6 +11771,7 @@
           </w:tcPr>
           <w:p>
             <w:pPr>
+              <w:keepNext/>
               <w:jc w:val="center"/>
               <w:rPr>
                 <w:sz w:val="24"/>
@@ -11613,6 +11802,7 @@
           </w:tcPr>
           <w:p>
             <w:pPr>
+              <w:keepNext/>
               <w:jc w:val="center"/>
               <w:rPr>
                 <w:sz w:val="24"/>
@@ -11643,6 +11833,7 @@
           </w:tcPr>
           <w:p>
             <w:pPr>
+              <w:keepNext/>
               <w:jc w:val="center"/>
               <w:rPr>
                 <w:sz w:val="24"/>
@@ -11663,6 +11854,7 @@
       </w:tr>
       <w:tr>
         <w:trPr>
+          <w:cantSplit/>
           <w:jc w:val="center"/>
         </w:trPr>
         <w:tc>
@@ -11734,7 +11926,7 @@
           </w:tcPr>
           <w:p>
             <w:pPr>
-              <w:jc w:val="both"/>
+              <w:jc w:val="left"/>
               <w:rPr>
                 <w:sz w:val="24"/>
                 <w:szCs w:val="24"/>
@@ -11753,6 +11945,7 @@
       </w:tr>
       <w:tr>
         <w:trPr>
+          <w:cantSplit/>
           <w:jc w:val="center"/>
         </w:trPr>
         <w:tc>
@@ -11824,7 +12017,7 @@
           </w:tcPr>
           <w:p>
             <w:pPr>
-              <w:jc w:val="both"/>
+              <w:jc w:val="left"/>
               <w:rPr>
                 <w:sz w:val="24"/>
                 <w:szCs w:val="24"/>
@@ -11843,6 +12036,7 @@
       </w:tr>
       <w:tr>
         <w:trPr>
+          <w:cantSplit/>
           <w:jc w:val="center"/>
         </w:trPr>
         <w:tc>
@@ -11914,7 +12108,7 @@
           </w:tcPr>
           <w:p>
             <w:pPr>
-              <w:jc w:val="both"/>
+              <w:jc w:val="left"/>
               <w:rPr>
                 <w:sz w:val="24"/>
                 <w:szCs w:val="24"/>
@@ -11933,6 +12127,7 @@
       </w:tr>
       <w:tr>
         <w:trPr>
+          <w:cantSplit/>
           <w:jc w:val="center"/>
         </w:trPr>
         <w:tc>
@@ -12004,7 +12199,7 @@
           </w:tcPr>
           <w:p>
             <w:pPr>
-              <w:jc w:val="both"/>
+              <w:jc w:val="left"/>
               <w:rPr>
                 <w:sz w:val="24"/>
                 <w:szCs w:val="24"/>
@@ -12049,6 +12244,7 @@
     <w:p>
       <w:pPr>
         <w:pStyle w:val="Heading1"/>
+        <w:keepNext/>
         <w:numPr>
           <w:ilvl w:val="0"/>
           <w:numId w:val="7"/>
@@ -12074,6 +12270,8 @@
       </w:tblGrid>
       <w:tr>
         <w:trPr>
+          <w:cantSplit/>
+          <w:tblHeader/>
           <w:jc w:val="center"/>
         </w:trPr>
         <w:tc>
@@ -12089,6 +12287,7 @@
           </w:tcPr>
           <w:p>
             <w:pPr>
+              <w:keepNext/>
               <w:jc w:val="center"/>
               <w:rPr>
                 <w:sz w:val="24"/>
@@ -12119,6 +12318,7 @@
           </w:tcPr>
           <w:p>
             <w:pPr>
+              <w:keepNext/>
               <w:jc w:val="center"/>
               <w:rPr>
                 <w:sz w:val="24"/>
@@ -12139,6 +12339,7 @@
       </w:tr>
       <w:tr>
         <w:trPr>
+          <w:cantSplit/>
           <w:jc w:val="center"/>
         </w:trPr>
         <w:tc>
@@ -12200,6 +12401,7 @@
       </w:tr>
       <w:tr>
         <w:trPr>
+          <w:cantSplit/>
           <w:jc w:val="center"/>
         </w:trPr>
         <w:tc>
@@ -12261,6 +12463,7 @@
       </w:tr>
       <w:tr>
         <w:trPr>
+          <w:cantSplit/>
           <w:jc w:val="center"/>
         </w:trPr>
         <w:tc>
@@ -12322,6 +12525,7 @@
       </w:tr>
       <w:tr>
         <w:trPr>
+          <w:cantSplit/>
           <w:jc w:val="center"/>
         </w:trPr>
         <w:tc>
@@ -12383,6 +12587,7 @@
       </w:tr>
       <w:tr>
         <w:trPr>
+          <w:cantSplit/>
           <w:jc w:val="center"/>
         </w:trPr>
         <w:tc>
@@ -12444,6 +12649,7 @@
       </w:tr>
       <w:tr>
         <w:trPr>
+          <w:cantSplit/>
           <w:jc w:val="center"/>
         </w:trPr>
         <w:tc>
@@ -12505,6 +12711,7 @@
       </w:tr>
       <w:tr>
         <w:trPr>
+          <w:cantSplit/>
           <w:jc w:val="center"/>
         </w:trPr>
         <w:tc>
@@ -12566,6 +12773,7 @@
       </w:tr>
       <w:tr>
         <w:trPr>
+          <w:cantSplit/>
           <w:jc w:val="center"/>
         </w:trPr>
         <w:tc>
@@ -12684,7 +12892,7 @@
           <w:sz w:val="24"/>
           <w:szCs w:val="24"/>
         </w:rPr>
-        <w:t xml:space="preserve">Dokumen ini berstatus Draft dan baru berlaku sesudah Direktur Utama menandatangani blok Approved By. Konfirmasi butir yang masih terbuka pada bagian Butir Menunggu Konfirmasi dapat mengubah Gambar 1, Gambar 2, dan daftar jabatan.</w:t>
+        <w:t xml:space="preserve">Dokumen ini berstatus Draft dan baru berlaku setelah Direktur Utama menandatangani blok Approved By. Butir yang masih terbuka pada bagian Butir Menunggu Konfirmasi dapat mengubah Gambar 1, Gambar 2, dan daftar jabatan setelah dikonfirmasi.</w:t>
       </w:r>
     </w:p>
     <w:p>
@@ -12708,7 +12916,7 @@
           <w:sz w:val="24"/>
           <w:szCs w:val="24"/>
         </w:rPr>
-        <w:t xml:space="preserve">HR Lead meninjau dokumen ini setiap tahun, dan lebih awal bila jabatan atau garis lapor berubah secara signifikan.</w:t>
+        <w:t xml:space="preserve">HR Lead meninjau dokumen ini setiap tahun, dan lebih awal jika jabatan atau garis lapor berubah secara signifikan.</w:t>
       </w:r>
     </w:p>
     <w:sectPr>

</xml_diff>